<commit_message>
v1.4a: simulated supplier names across Projects 01-06
All 17 suppliers renamed to simulated names that state their function
(CloudCo, CodeCo, OfficeCo, ChatCo, PaymentsCo and others) in Markdown,
CSV, workbooks, Word and PDF files. Stand-in disclosure sentences removed;
one Simulated case study line kept per page. Workbooks recalculated:
0 formula errors, no numeric change.

Claude-Session: https://claude.ai/code/session_01TQeRkTQscLLdPxf8AsP1RD
</commit_message>
<xml_diff>
--- a/01-security-policy-pack/01-security-policy-pack.docx
+++ b/01-security-policy-pack/01-security-policy-pack.docx
@@ -728,7 +728,7 @@
               <w:rPr>
                 <w:sz w:val="17"/>
               </w:rPr>
-              <w:t xml:space="preserve">Amazon Web Services (AWS)</w:t>
+              <w:t xml:space="preserve">CloudCo</w:t>
             </w:r>
           </w:p>
         </w:tc>
@@ -769,7 +769,7 @@
               <w:rPr>
                 <w:sz w:val="17"/>
               </w:rPr>
-              <w:t xml:space="preserve">GitHub</w:t>
+              <w:t xml:space="preserve">CodeCo</w:t>
             </w:r>
           </w:p>
         </w:tc>
@@ -812,7 +812,7 @@
               <w:rPr>
                 <w:sz w:val="17"/>
               </w:rPr>
-              <w:t xml:space="preserve">Slack</w:t>
+              <w:t xml:space="preserve">ChatCo</w:t>
             </w:r>
           </w:p>
         </w:tc>
@@ -853,7 +853,7 @@
               <w:rPr>
                 <w:sz w:val="17"/>
               </w:rPr>
-              <w:t xml:space="preserve">Google Workspace</w:t>
+              <w:t xml:space="preserve">OfficeCo</w:t>
             </w:r>
           </w:p>
         </w:tc>
@@ -896,7 +896,7 @@
               <w:rPr>
                 <w:sz w:val="17"/>
               </w:rPr>
-              <w:t xml:space="preserve">Stripe (Cypher stores payment metadata only; card numbers are held by Stripe)</w:t>
+              <w:t xml:space="preserve">PaymentsCo (Cypher stores payment metadata only; card numbers are held by PaymentsCo)</w:t>
             </w:r>
           </w:p>
         </w:tc>
@@ -4105,7 +4105,7 @@
         <w:pStyle w:val="Compact"/>
       </w:pPr>
       <w:r>
-        <w:t xml:space="preserve">All Cypher Group accounts, including Google Workspace, Slack, GitHub, Amazon Web Services, the Stripe dashboard and any other system holding Cypher Group information.</w:t>
+        <w:t xml:space="preserve">All Cypher Group accounts, including OfficeCo, ChatCo, CodeCo, CloudCo, the PaymentsCo dashboard and any other system holding Cypher Group information.</w:t>
       </w:r>
     </w:p>
     <w:p>
@@ -4499,7 +4499,7 @@
         <w:pStyle w:val="BodyText"/>
       </w:pPr>
       <w:r>
-        <w:t xml:space="preserve">4.1.2 Limited, reasonable personal use of email, Slack and internet access</w:t>
+        <w:t xml:space="preserve">4.1.2 Limited, reasonable personal use of email, ChatCo and internet access</w:t>
       </w:r>
       <w:r>
         <w:t xml:space="preserve"> </w:t>
@@ -4740,7 +4740,7 @@
         <w:t xml:space="preserve"> </w:t>
       </w:r>
       <w:r>
-        <w:t xml:space="preserve">store credentials in browsers, spreadsheets, notes applications, Slack messages or source code.</w:t>
+        <w:t xml:space="preserve">store credentials in browsers, spreadsheets, notes applications, ChatCo messages or source code.</w:t>
       </w:r>
     </w:p>
     <w:p>
@@ -4779,7 +4779,7 @@
         <w:pStyle w:val="FirstParagraph"/>
       </w:pPr>
       <w:r>
-        <w:t xml:space="preserve">4.4.1 Any device used to access Cypher Group email, Slack, documents or code</w:t>
+        <w:t xml:space="preserve">4.4.1 Any device used to access Cypher Group email, ChatCo, documents or code</w:t>
       </w:r>
       <w:r>
         <w:t xml:space="preserve"> </w:t>
@@ -5201,7 +5201,7 @@
         <w:t xml:space="preserve"> </w:t>
       </w:r>
       <w:r>
-        <w:t xml:space="preserve">exercise care when addressing email and Slack messages containing Confidential or Restricted information, and</w:t>
+        <w:t xml:space="preserve">exercise care when addressing email and ChatCo messages containing Confidential or Restricted information, and</w:t>
       </w:r>
       <w:r>
         <w:t xml:space="preserve"> </w:t>
@@ -7882,7 +7882,7 @@
         <w:t xml:space="preserve"> </w:t>
       </w:r>
       <w:r>
-        <w:t xml:space="preserve">Google Workspace, Slack, GitHub, Amazon Web Services, the Stripe dashboard,</w:t>
+        <w:t xml:space="preserve">OfficeCo, ChatCo, CodeCo, CloudCo, the PaymentsCo dashboard,</w:t>
       </w:r>
       <w:r>
         <w:t xml:space="preserve"> </w:t>
@@ -8465,7 +8465,7 @@
         <w:t xml:space="preserve"> </w:t>
       </w:r>
       <w:r>
-        <w:t xml:space="preserve">be stored in browser password stores, spreadsheets, documents, notes applications, Slack messages, Jira tickets or source code.</w:t>
+        <w:t xml:space="preserve">be stored in browser password stores, spreadsheets, documents, notes applications, ChatCo messages, Jira tickets or source code.</w:t>
       </w:r>
     </w:p>
     <w:p>
@@ -8611,7 +8611,7 @@
         <w:t xml:space="preserve"> </w:t>
       </w:r>
       <w:r>
-        <w:t xml:space="preserve">Cypher Group accounts, without exception, on the following systems as a minimum: Google Workspace, Slack, GitHub, Amazon Web Services, the Stripe dashboard, and the production database administration interface.</w:t>
+        <w:t xml:space="preserve">Cypher Group accounts, without exception, on the following systems as a minimum: OfficeCo, ChatCo, CodeCo, CloudCo, the PaymentsCo dashboard, and the production database administration interface.</w:t>
       </w:r>
     </w:p>
     <w:p>
@@ -8985,7 +8985,7 @@
           <w:bCs/>
           <w:b/>
         </w:rPr>
-        <w:t xml:space="preserve">AWS root account</w:t>
+        <w:t xml:space="preserve">CloudCo root account</w:t>
       </w:r>
       <w:r>
         <w:t xml:space="preserve"> </w:t>
@@ -9160,7 +9160,7 @@
         <w:t xml:space="preserve"> </w:t>
       </w:r>
       <w:r>
-        <w:t xml:space="preserve">be committed to any GitHub repository. GitHub secret scanning and push protection</w:t>
+        <w:t xml:space="preserve">be committed to any CodeCo repository. CodeCo secret scanning and push protection</w:t>
       </w:r>
       <w:r>
         <w:t xml:space="preserve"> </w:t>
@@ -9258,7 +9258,7 @@
         <w:pStyle w:val="FirstParagraph"/>
       </w:pPr>
       <w:r>
-        <w:t xml:space="preserve">4.6.1 Where a third-party service supports single sign-on through Google Workspace, Cypher Group</w:t>
+        <w:t xml:space="preserve">4.6.1 Where a third-party service supports single sign-on through OfficeCo, Cypher Group</w:t>
       </w:r>
       <w:r>
         <w:t xml:space="preserve"> </w:t>
@@ -11237,7 +11237,7 @@
         <w:t xml:space="preserve"> </w:t>
       </w:r>
       <w:r>
-        <w:t xml:space="preserve">including Google Workspace, Slack, GitHub, Amazon Web Services, the Stripe</w:t>
+        <w:t xml:space="preserve">including OfficeCo, ChatCo, CodeCo, CloudCo, the PaymentsCo</w:t>
       </w:r>
       <w:r>
         <w:t xml:space="preserve"> </w:t>
@@ -11965,7 +11965,7 @@
               <w:rPr>
                 <w:sz w:val="17"/>
               </w:rPr>
-              <w:t xml:space="preserve">Google Workspace, Slack, GitHub (write, non-admin), AWS non-production, ticketing</w:t>
+              <w:t xml:space="preserve">OfficeCo, ChatCo, CodeCo (write, non-admin), CloudCo non-production, ticketing</w:t>
             </w:r>
           </w:p>
         </w:tc>
@@ -11983,7 +11983,7 @@
               <w:rPr>
                 <w:sz w:val="17"/>
               </w:rPr>
-              <w:t xml:space="preserve">AWS production, Stripe, production database, billing</w:t>
+              <w:t xml:space="preserve">CloudCo production, PaymentsCo, production database, billing</w:t>
             </w:r>
           </w:p>
         </w:tc>
@@ -12026,7 +12026,7 @@
               <w:rPr>
                 <w:sz w:val="17"/>
               </w:rPr>
-              <w:t xml:space="preserve">Engineering profile plus AWS production (time-bounded), production database read</w:t>
+              <w:t xml:space="preserve">Engineering profile plus CloudCo production (time-bounded), production database read</w:t>
             </w:r>
           </w:p>
         </w:tc>
@@ -12045,7 +12045,7 @@
               <w:rPr>
                 <w:sz w:val="17"/>
               </w:rPr>
-              <w:t xml:space="preserve">Stripe, billing, HR records</w:t>
+              <w:t xml:space="preserve">PaymentsCo, billing, HR records</w:t>
             </w:r>
           </w:p>
         </w:tc>
@@ -12086,7 +12086,7 @@
               <w:rPr>
                 <w:sz w:val="17"/>
               </w:rPr>
-              <w:t xml:space="preserve">Google Workspace, Slack, support platform, customer account read</w:t>
+              <w:t xml:space="preserve">OfficeCo, ChatCo, support platform, customer account read</w:t>
             </w:r>
           </w:p>
         </w:tc>
@@ -12104,7 +12104,7 @@
               <w:rPr>
                 <w:sz w:val="17"/>
               </w:rPr>
-              <w:t xml:space="preserve">Source code, AWS, Stripe, HR records</w:t>
+              <w:t xml:space="preserve">Source code, CloudCo, PaymentsCo, HR records</w:t>
             </w:r>
           </w:p>
         </w:tc>
@@ -12147,7 +12147,7 @@
               <w:rPr>
                 <w:sz w:val="17"/>
               </w:rPr>
-              <w:t xml:space="preserve">Google Workspace, Slack, CRM, customer account read</w:t>
+              <w:t xml:space="preserve">OfficeCo, ChatCo, CRM, customer account read</w:t>
             </w:r>
           </w:p>
         </w:tc>
@@ -12166,7 +12166,7 @@
               <w:rPr>
                 <w:sz w:val="17"/>
               </w:rPr>
-              <w:t xml:space="preserve">Source code, AWS, Stripe, production database</w:t>
+              <w:t xml:space="preserve">Source code, CloudCo, PaymentsCo, production database</w:t>
             </w:r>
           </w:p>
         </w:tc>
@@ -12207,7 +12207,7 @@
               <w:rPr>
                 <w:sz w:val="17"/>
               </w:rPr>
-              <w:t xml:space="preserve">Google Workspace, Slack, Stripe dashboard, accounting platform</w:t>
+              <w:t xml:space="preserve">OfficeCo, ChatCo, PaymentsCo dashboard, accounting platform</w:t>
             </w:r>
           </w:p>
         </w:tc>
@@ -12225,7 +12225,7 @@
               <w:rPr>
                 <w:sz w:val="17"/>
               </w:rPr>
-              <w:t xml:space="preserve">Source code, AWS, production database, HR records</w:t>
+              <w:t xml:space="preserve">Source code, CloudCo, production database, HR records</w:t>
             </w:r>
           </w:p>
         </w:tc>
@@ -12268,7 +12268,7 @@
               <w:rPr>
                 <w:sz w:val="17"/>
               </w:rPr>
-              <w:t xml:space="preserve">Google Workspace, Slack, HR platform, payroll</w:t>
+              <w:t xml:space="preserve">OfficeCo, ChatCo, HR platform, payroll</w:t>
             </w:r>
           </w:p>
         </w:tc>
@@ -12287,7 +12287,7 @@
               <w:rPr>
                 <w:sz w:val="17"/>
               </w:rPr>
-              <w:t xml:space="preserve">Source code, AWS, Stripe, customer data</w:t>
+              <w:t xml:space="preserve">Source code, CloudCo, PaymentsCo, customer data</w:t>
             </w:r>
           </w:p>
         </w:tc>
@@ -12933,7 +12933,7 @@
         <w:t xml:space="preserve"> </w:t>
       </w:r>
       <w:r>
-        <w:t xml:space="preserve">This includes Google Workspace, Slack, GitHub, AWS, Stripe, the production database, the support platform, all third-party services, and any physical access credential.</w:t>
+        <w:t xml:space="preserve">This includes OfficeCo, ChatCo, CodeCo, CloudCo, PaymentsCo, the production database, the support platform, all third-party services, and any physical access credential.</w:t>
       </w:r>
     </w:p>
     <w:p>
@@ -13068,7 +13068,7 @@
         <w:pStyle w:val="BodyText"/>
       </w:pPr>
       <w:r>
-        <w:t xml:space="preserve">4.5.6 The departing individual's Google Workspace and Slack accounts</w:t>
+        <w:t xml:space="preserve">4.5.6 The departing individual's OfficeCo and ChatCo accounts</w:t>
       </w:r>
       <w:r>
         <w:t xml:space="preserve"> </w:t>
@@ -16481,7 +16481,7 @@
               <w:rPr>
                 <w:sz w:val="17"/>
               </w:rPr>
-              <w:t xml:space="preserve">Team wiki pages, org chart, internal roadmap, meeting notes, most Slack channels, this policy pack</w:t>
+              <w:t xml:space="preserve">Team wiki pages, org chart, internal roadmap, meeting notes, most ChatCo channels, this policy pack</w:t>
             </w:r>
           </w:p>
         </w:tc>
@@ -16639,7 +16639,7 @@
               <w:rPr>
                 <w:sz w:val="17"/>
               </w:rPr>
-              <w:t xml:space="preserve">Stripe payment metadata, production database credentials, AWS root credentials, API keys and secrets, security incident records, bulk exports of customer personal data</w:t>
+              <w:t xml:space="preserve">PaymentsCo payment metadata, production database credentials, CloudCo root credentials, API keys and secrets, security incident records, bulk exports of customer personal data</w:t>
             </w:r>
           </w:p>
         </w:tc>
@@ -16801,7 +16801,7 @@
         <w:t xml:space="preserve">does not store payment card numbers</w:t>
       </w:r>
       <w:r>
-        <w:t xml:space="preserve">. Card data is held by Stripe. Cypher Group holds</w:t>
+        <w:t xml:space="preserve">. Card data is held by PaymentsCo. Cypher Group holds</w:t>
       </w:r>
       <w:r>
         <w:t xml:space="preserve"> </w:t>
@@ -17257,7 +17257,7 @@
               <w:rPr>
                 <w:sz w:val="17"/>
               </w:rPr>
-              <w:t xml:space="preserve">Google Workspace, Slack, approved SaaS</w:t>
+              <w:t xml:space="preserve">OfficeCo, ChatCo, approved SaaS</w:t>
             </w:r>
           </w:p>
         </w:tc>
@@ -17275,7 +17275,7 @@
               <w:rPr>
                 <w:sz w:val="17"/>
               </w:rPr>
-              <w:t xml:space="preserve">Google Workspace with restricted sharing, GitHub private repositories, AWS production</w:t>
+              <w:t xml:space="preserve">OfficeCo with restricted sharing, CodeCo private repositories, CloudCo production</w:t>
             </w:r>
           </w:p>
         </w:tc>
@@ -17647,7 +17647,7 @@
               <w:rPr>
                 <w:sz w:val="17"/>
               </w:rPr>
-              <w:t xml:space="preserve">Company email, Slack</w:t>
+              <w:t xml:space="preserve">Company email, ChatCo</w:t>
             </w:r>
           </w:p>
         </w:tc>
@@ -17665,7 +17665,7 @@
               <w:rPr>
                 <w:sz w:val="17"/>
               </w:rPr>
-              <w:t xml:space="preserve">Company email, Slack, approved file sharing with link expiry</w:t>
+              <w:t xml:space="preserve">Company email, ChatCo, approved file sharing with link expiry</w:t>
             </w:r>
           </w:p>
         </w:tc>
@@ -18439,7 +18439,7 @@
         <w:pStyle w:val="BodyText"/>
       </w:pPr>
       <w:r>
-        <w:t xml:space="preserve">4.3.2 Slack channels carrying Confidential or Restricted information</w:t>
+        <w:t xml:space="preserve">4.3.2 ChatCo channels carrying Confidential or Restricted information</w:t>
       </w:r>
       <w:r>
         <w:t xml:space="preserve"> </w:t>
@@ -21959,7 +21959,7 @@
               <w:rPr>
                 <w:sz w:val="17"/>
               </w:rPr>
-              <w:t xml:space="preserve">Slack</w:t>
+              <w:t xml:space="preserve">ChatCo</w:t>
             </w:r>
           </w:p>
         </w:tc>
@@ -22313,7 +22313,7 @@
         <w:t xml:space="preserve"> </w:t>
       </w:r>
       <w:r>
-        <w:t xml:space="preserve">discuss a suspected or confirmed incident with anyone outside the response team, including customers, on social media, or in public Slack channels, until the Communications Lead authorises it.</w:t>
+        <w:t xml:space="preserve">discuss a suspected or confirmed incident with anyone outside the response team, including customers, on social media, or in public ChatCo channels, until the Communications Lead authorises it.</w:t>
       </w:r>
     </w:p>
     <w:p>
@@ -22955,7 +22955,7 @@
               <w:rPr>
                 <w:sz w:val="17"/>
               </w:rPr>
-              <w:t xml:space="preserve">Reported phishing email, not clicked; misconfigured Slack channel corrected</w:t>
+              <w:t xml:space="preserve">Reported phishing email, not clicked; misconfigured ChatCo channel corrected</w:t>
             </w:r>
           </w:p>
         </w:tc>

</xml_diff>

<commit_message>
Rename simulated CEO to Jerry Gold across reports, data, PDFs and workbooks
</commit_message>
<xml_diff>
--- a/01-security-policy-pack/01-security-policy-pack.docx
+++ b/01-security-policy-pack/01-security-policy-pack.docx
@@ -303,7 +303,7 @@
               <w:rPr>
                 <w:sz w:val="17"/>
               </w:rPr>
-              <w:t xml:space="preserve">Jerry Olugboye, Chief Executive Officer</w:t>
+              <w:t xml:space="preserve">Jerry Gold, Chief Executive Officer</w:t>
             </w:r>
           </w:p>
         </w:tc>
@@ -2920,7 +2920,7 @@
               <w:rPr>
                 <w:sz w:val="17"/>
               </w:rPr>
-              <w:t xml:space="preserve">Jerry Olugboye</w:t>
+              <w:t xml:space="preserve">Jerry Gold</w:t>
             </w:r>
           </w:p>
         </w:tc>
@@ -3553,7 +3553,7 @@
               <w:rPr>
                 <w:sz w:val="17"/>
               </w:rPr>
-              <w:t xml:space="preserve">Jerry Olugboye, Chief Executive Officer</w:t>
+              <w:t xml:space="preserve">Jerry Gold, Chief Executive Officer</w:t>
             </w:r>
           </w:p>
         </w:tc>
@@ -4010,7 +4010,7 @@
               <w:rPr>
                 <w:sz w:val="17"/>
               </w:rPr>
-              <w:t xml:space="preserve">Jerry Olugboye</w:t>
+              <w:t xml:space="preserve">Jerry Gold</w:t>
             </w:r>
           </w:p>
         </w:tc>
@@ -7252,7 +7252,7 @@
               <w:rPr>
                 <w:sz w:val="17"/>
               </w:rPr>
-              <w:t xml:space="preserve">Jerry Olugboye, Chief Executive Officer</w:t>
+              <w:t xml:space="preserve">Jerry Gold, Chief Executive Officer</w:t>
             </w:r>
           </w:p>
         </w:tc>
@@ -7709,7 +7709,7 @@
               <w:rPr>
                 <w:sz w:val="17"/>
               </w:rPr>
-              <w:t xml:space="preserve">Jerry Olugboye</w:t>
+              <w:t xml:space="preserve">Jerry Gold</w:t>
             </w:r>
           </w:p>
         </w:tc>
@@ -10669,7 +10669,7 @@
               <w:rPr>
                 <w:sz w:val="17"/>
               </w:rPr>
-              <w:t xml:space="preserve">Jerry Olugboye, Chief Executive Officer</w:t>
+              <w:t xml:space="preserve">Jerry Gold, Chief Executive Officer</w:t>
             </w:r>
           </w:p>
         </w:tc>
@@ -11126,7 +11126,7 @@
               <w:rPr>
                 <w:sz w:val="17"/>
               </w:rPr>
-              <w:t xml:space="preserve">Jerry Olugboye</w:t>
+              <w:t xml:space="preserve">Jerry Gold</w:t>
             </w:r>
           </w:p>
         </w:tc>
@@ -14908,7 +14908,7 @@
               <w:rPr>
                 <w:sz w:val="17"/>
               </w:rPr>
-              <w:t xml:space="preserve">Jerry Olugboye, Chief Executive Officer</w:t>
+              <w:t xml:space="preserve">Jerry Gold, Chief Executive Officer</w:t>
             </w:r>
           </w:p>
         </w:tc>
@@ -15365,7 +15365,7 @@
               <w:rPr>
                 <w:sz w:val="17"/>
               </w:rPr>
-              <w:t xml:space="preserve">Jerry Olugboye</w:t>
+              <w:t xml:space="preserve">Jerry Gold</w:t>
             </w:r>
           </w:p>
         </w:tc>
@@ -16159,7 +16159,7 @@
               <w:rPr>
                 <w:sz w:val="17"/>
               </w:rPr>
-              <w:t xml:space="preserve">Jerry Olugboye</w:t>
+              <w:t xml:space="preserve">Jerry Gold</w:t>
             </w:r>
           </w:p>
         </w:tc>
@@ -20292,7 +20292,7 @@
               <w:rPr>
                 <w:sz w:val="17"/>
               </w:rPr>
-              <w:t xml:space="preserve">Jerry Olugboye, Chief Executive Officer</w:t>
+              <w:t xml:space="preserve">Jerry Gold, Chief Executive Officer</w:t>
             </w:r>
           </w:p>
         </w:tc>
@@ -20749,7 +20749,7 @@
               <w:rPr>
                 <w:sz w:val="17"/>
               </w:rPr>
-              <w:t xml:space="preserve">Jerry Olugboye</w:t>
+              <w:t xml:space="preserve">Jerry Gold</w:t>
             </w:r>
           </w:p>
         </w:tc>

</xml_diff>